<commit_message>
refactor: extract helpers to R/, add checkmate validation and tests
</commit_message>
<xml_diff>
--- a/output/reports/scripts/analysis/unified_retention_analysis.docx
+++ b/output/reports/scripts/analysis/unified_retention_analysis.docx
@@ -63,7 +63,7 @@
         <w:pStyle w:val="Date"/>
       </w:pPr>
       <w:r>
-        <w:t xml:space="preserve">2025-11-21</w:t>
+        <w:t xml:space="preserve">2025-12-31</w:t>
       </w:r>
     </w:p>
     <w:sdt>
@@ -120,7 +120,7 @@
           <w:rPr>
             <w:rStyle w:val="Hyperlink"/>
           </w:rPr>
-          <w:t xml:space="preserve">https://github.com/mikehickey2/US-Airline-Pilot-Retention-Analysis</w:t>
+          <w:t xml:space="preserve">GitHub</w:t>
         </w:r>
       </w:hyperlink>
     </w:p>
@@ -573,7 +573,7 @@
         <w:t xml:space="preserve"> </w:t>
       </w:r>
       <w:r>
-        <w:t xml:space="preserve">in the GitHub repository:</w:t>
+        <w:t xml:space="preserve">in the</w:t>
       </w:r>
       <w:r>
         <w:t xml:space="preserve"> </w:t>
@@ -583,9 +583,12 @@
           <w:rPr>
             <w:rStyle w:val="Hyperlink"/>
           </w:rPr>
-          <w:t xml:space="preserve">https://github.com/mikehickey2/US-Airline-Pilot-Retention-Analysis</w:t>
+          <w:t xml:space="preserve">GitHub repository</w:t>
         </w:r>
       </w:hyperlink>
+      <w:r>
+        <w:t xml:space="preserve">.</w:t>
+      </w:r>
     </w:p>
     <w:bookmarkEnd w:id="30"/>
     <w:bookmarkEnd w:id="31"/>
@@ -10721,7 +10724,7 @@
               <w:jc w:val="left"/>
             </w:pPr>
             <w:r>
-              <w:t xml:space="preserve">Age (≤35 vs &gt;35)</w:t>
+              <w:t xml:space="preserve">Age (&lt;=35 vs &gt;35)</w:t>
             </w:r>
           </w:p>
         </w:tc>

</xml_diff>